<commit_message>
Combine templates into one black-text manuscript template
- Single DOCX: title page as page 1 (removed by editorial office before
  review), manuscript body from page 2
- All fonts black; no colored headings or instructions
- Figure specs added to template and author guidelines: >=300 dpi
  (600 dpi line art), 8 or 16 cm width, ~4:3 or 16:9 ratio, >=8 pt fonts
- Site links updated to the single template; title page row merged into
  the manuscript row on the submission page

https://claude.ai/code/session_01SrWddAbtU92UMVUdNrSrYW
</commit_message>
<xml_diff>
--- a/assets/templates/juhr-manuscript-template.docx
+++ b/assets/templates/juhr-manuscript-template.docx
@@ -10,10 +10,10 @@
         <w:rPr>
           <w:rFonts w:ascii="Arial" w:hAnsi="Arial"/>
           <w:b/>
-          <w:color w:val="1D5C39"/>
+          <w:color w:val="000000"/>
           <w:sz w:val="18"/>
         </w:rPr>
-        <w:t>JOURNAL OF UNDERGRADUATE HORTICULTURAL RESEARCH (JUHR)</w:t>
+        <w:t>JOURNAL OF UNDERGRADUATE HORTICULTURAL RESEARCH (JUHR) - MANUSCRIPT TEMPLATE</w:t>
       </w:r>
     </w:p>
     <w:p>
@@ -23,10 +23,32 @@
       <w:r>
         <w:rPr>
           <w:i/>
-          <w:color w:val="777777"/>
+          <w:color w:val="000000"/>
           <w:sz w:val="20"/>
         </w:rPr>
-        <w:t>Manuscript template. Replace the bracketed text with your content and delete all gray instructions before submitting. Do NOT include author names or affiliations in this file - they go in the separate title page file (manuscripts are reviewed anonymously). Main text may be written in Korean or English; the title, abstract, keywords, references, and all figure/table captions must be in English.</w:t>
+        <w:t>How to use: replace the bracketed text with your content and delete all italic instructions before submitting. Page 1 is the title page; the editorial office removes it before sending the manuscript to reviewers. Main text may be written in Korean or English; the title, abstract, keywords, references, and all figure/table captions must be in English.</w:t>
+      </w:r>
+    </w:p>
+    <w:p>
+      <w:pPr>
+        <w:pStyle w:val="Heading1"/>
+      </w:pPr>
+      <w:r>
+        <w:t>Title Page</w:t>
+      </w:r>
+    </w:p>
+    <w:p>
+      <w:pPr>
+        <w:spacing w:line="240" w:lineRule="auto" w:before="200" w:after="200"/>
+      </w:pPr>
+      <w:r>
+        <w:rPr>
+          <w:rFonts w:ascii="Arial" w:hAnsi="Arial"/>
+          <w:b/>
+          <w:color w:val="000000"/>
+          <w:sz w:val="32"/>
+        </w:rPr>
+        <w:t>[Manuscript Title in English: Concise, Specific, and Informative]</w:t>
       </w:r>
     </w:p>
     <w:p>
@@ -38,6 +60,106 @@
       </w:r>
     </w:p>
     <w:p>
+      <w:r>
+        <w:rPr>
+          <w:b w:val="0"/>
+        </w:rPr>
+      </w:r>
+    </w:p>
+    <w:p>
+      <w:r>
+        <w:rPr>
+          <w:b/>
+        </w:rPr>
+        <w:t>Authors and affiliations:</w:t>
+      </w:r>
+    </w:p>
+    <w:p>
+      <w:pPr>
+        <w:spacing w:line="240" w:lineRule="auto" w:after="160"/>
+      </w:pPr>
+      <w:r>
+        <w:rPr>
+          <w:i/>
+          <w:color w:val="000000"/>
+          <w:sz w:val="20"/>
+        </w:rPr>
+        <w:t>List every author in order, marking affiliations with superscript numbers. Mark the undergraduate first author with * and the corresponding author with †. Example:</w:t>
+      </w:r>
+    </w:p>
+    <w:p>
+      <w:r>
+        <w:rPr>
+          <w:b w:val="0"/>
+        </w:rPr>
+        <w:t>Gildong Hong1*, Younghee Kim1, Sun Woo Chung1†</w:t>
+      </w:r>
+    </w:p>
+    <w:p>
+      <w:r>
+        <w:rPr>
+          <w:b w:val="0"/>
+        </w:rPr>
+        <w:t>1 Department of Horticulture, Chonnam National University, Gwangju, Republic of Korea</w:t>
+      </w:r>
+    </w:p>
+    <w:p>
+      <w:r>
+        <w:rPr>
+          <w:b w:val="0"/>
+        </w:rPr>
+      </w:r>
+    </w:p>
+    <w:p>
+      <w:r>
+        <w:rPr>
+          <w:b w:val="0"/>
+        </w:rPr>
+        <w:t>* Undergraduate first author: [name, student status/year]</w:t>
+      </w:r>
+    </w:p>
+    <w:p>
+      <w:r>
+        <w:rPr>
+          <w:b w:val="0"/>
+        </w:rPr>
+        <w:t>† Corresponding author: [name, email]</w:t>
+      </w:r>
+    </w:p>
+    <w:p>
+      <w:r>
+        <w:rPr>
+          <w:b w:val="0"/>
+        </w:rPr>
+      </w:r>
+    </w:p>
+    <w:p>
+      <w:r>
+        <w:rPr>
+          <w:b w:val="0"/>
+        </w:rPr>
+        <w:t>Origin of the work: [course / capstone project / undergraduate research program / independent study - include course or program name if applicable]</w:t>
+      </w:r>
+    </w:p>
+    <w:p>
+      <w:r>
+        <w:rPr>
+          <w:b w:val="0"/>
+        </w:rPr>
+      </w:r>
+    </w:p>
+    <w:p>
+      <w:r>
+        <w:rPr>
+          <w:b w:val="0"/>
+        </w:rPr>
+        <w:t>Acknowledgments and funding: [or "None."]</w:t>
+      </w:r>
+      <w:r>
+        <w:br w:type="page"/>
+      </w:r>
+    </w:p>
+    <w:p>
       <w:pPr>
         <w:spacing w:line="240" w:lineRule="auto" w:before="200" w:after="200"/>
       </w:pPr>
@@ -45,10 +167,10 @@
         <w:rPr>
           <w:rFonts w:ascii="Arial" w:hAnsi="Arial"/>
           <w:b/>
-          <w:color w:val="222222"/>
-          <w:sz w:val="34"/>
+          <w:color w:val="000000"/>
+          <w:sz w:val="32"/>
         </w:rPr>
-        <w:t>[Manuscript Title in English: Concise, Specific, and Informative]</w:t>
+        <w:t>[Manuscript Title in English - identical to the title page]</w:t>
       </w:r>
     </w:p>
     <w:p>
@@ -66,7 +188,7 @@
       <w:r>
         <w:rPr>
           <w:i/>
-          <w:color w:val="777777"/>
+          <w:color w:val="000000"/>
           <w:sz w:val="20"/>
         </w:rPr>
         <w:t>One paragraph, maximum 250 words, in English, no citations. State the question, the approach, the main findings or argument, and the significance.</w:t>
@@ -103,7 +225,7 @@
       <w:r>
         <w:rPr>
           <w:i/>
-          <w:color w:val="777777"/>
+          <w:color w:val="000000"/>
           <w:sz w:val="20"/>
         </w:rPr>
         <w:t>Introduce the topic, summarize relevant literature, and clearly state your research question or objective in the final paragraph.</w:t>
@@ -132,7 +254,7 @@
       <w:r>
         <w:rPr>
           <w:i/>
-          <w:color w:val="777777"/>
+          <w:color w:val="000000"/>
           <w:sz w:val="20"/>
         </w:rPr>
         <w:t>Describe materials, experimental design, data collection, and analysis in enough detail for another student to repeat the work. For reviews, hypotheses, and perspectives, rename or reorganize sections 2-4 to fit your argument (e.g., thematic headings).</w:t>
@@ -161,7 +283,7 @@
       <w:r>
         <w:rPr>
           <w:i/>
-          <w:color w:val="777777"/>
+          <w:color w:val="000000"/>
           <w:sz w:val="20"/>
         </w:rPr>
         <w:t>Report findings objectively. Cite every figure and table in order, e.g., (Fig. 1), (Table 1).</w:t>
@@ -190,7 +312,7 @@
       <w:r>
         <w:rPr>
           <w:i/>
-          <w:color w:val="777777"/>
+          <w:color w:val="000000"/>
           <w:sz w:val="20"/>
         </w:rPr>
         <w:t>Interpret the results, compare them with published literature, state limitations, and explain the significance.</w:t>
@@ -235,7 +357,7 @@
       <w:r>
         <w:rPr>
           <w:i/>
-          <w:color w:val="777777"/>
+          <w:color w:val="000000"/>
           <w:sz w:val="20"/>
         </w:rPr>
         <w:t>Describe which AI tools you used and for what purpose, or state that none were used. Example: "ChatGPT was used for language editing of the abstract; all content was verified by the authors."</w:t>
@@ -264,7 +386,7 @@
       <w:r>
         <w:rPr>
           <w:i/>
-          <w:color w:val="777777"/>
+          <w:color w:val="000000"/>
           <w:sz w:val="20"/>
         </w:rPr>
         <w:t>APA style, alphabetical, in English. Cite in the text as (Kim and Lee, 2024). Include DOIs where available. Examples below - replace with your own.</w:t>
@@ -301,7 +423,7 @@
       <w:r>
         <w:rPr>
           <w:i/>
-          <w:color w:val="777777"/>
+          <w:color w:val="000000"/>
           <w:sz w:val="20"/>
         </w:rPr>
         <w:t>One table per page, numbered in citation order, with a self-contained English caption ABOVE the table. All table text must be in English.</w:t>
@@ -474,10 +596,10 @@
       <w:r>
         <w:rPr>
           <w:i/>
-          <w:color w:val="777777"/>
+          <w:color w:val="000000"/>
           <w:sz w:val="20"/>
         </w:rPr>
-        <w:t>List all figure captions here, in English. Submit figure image files separately (PNG, JPEG, or TIFF); do not paste figures into this file.</w:t>
+        <w:t>List all figure captions here, in English. Submit figure image files separately (PNG, JPEG, or TIFF); do not paste figures into this file. Figure requirements: resolution of at least 300 dpi at final print size (600 dpi for line art); width 8 cm (single column) or 16 cm (full width); keep a width-to-height ratio of about 4:3 (or 16:9 for wide panels); use a minimum 8 pt font for text inside figures.</w:t>
       </w:r>
     </w:p>
     <w:p>
@@ -510,7 +632,7 @@
     <w:r>
       <w:rPr>
         <w:rFonts w:ascii="Arial" w:hAnsi="Arial"/>
-        <w:color w:val="777777"/>
+        <w:color w:val="000000"/>
         <w:sz w:val="18"/>
       </w:rPr>
       <w:fldChar w:fldCharType="begin"/>
@@ -889,7 +1011,7 @@
     </w:pPr>
     <w:rPr>
       <w:rFonts w:ascii="Times New Roman" w:hAnsi="Times New Roman" w:eastAsia="Malgun Gothic"/>
-      <w:color w:val="222222"/>
+      <w:color w:val="000000"/>
       <w:sz w:val="24"/>
     </w:rPr>
   </w:style>
@@ -955,7 +1077,7 @@
       <w:rFonts w:asciiTheme="majorHAnsi" w:eastAsiaTheme="majorEastAsia" w:hAnsiTheme="majorHAnsi" w:cstheme="majorBidi" w:ascii="Arial" w:hAnsi="Arial" w:eastAsia="Malgun Gothic"/>
       <w:b/>
       <w:bCs/>
-      <w:color w:val="1D5C39"/>
+      <w:color w:val="000000"/>
       <w:sz w:val="26"/>
       <w:szCs w:val="28"/>
     </w:rPr>

</xml_diff>